<commit_message>
Update student name and ID in reports
</commit_message>
<xml_diff>
--- a/docs/form.docx
+++ b/docs/form.docx
@@ -578,7 +578,7 @@
                 <w:rtl/>
                 <w:lang w:bidi="fa-IR"/>
               </w:rPr>
-              <w:t xml:space="preserve"> نرگس حسینی‌پور</w:t>
+              <w:t xml:space="preserve"> علی محمدی</w:t>
             </w:r>
             <w:r>
               <w:rPr>
@@ -613,7 +613,7 @@
                 <w:rtl/>
                 <w:lang w:bidi="fa-IR"/>
               </w:rPr>
-              <w:t>۸۱۰۱۰۰۱۲۶</w:t>
+              <w:t>۸۱۰۱۰۳۳۰۷</w:t>
             </w:r>
             <w:r>
               <w:rPr>

</xml_diff>

<commit_message>
Update project title and degree field
</commit_message>
<xml_diff>
--- a/docs/form.docx
+++ b/docs/form.docx
@@ -578,7 +578,7 @@
                 <w:rtl/>
                 <w:lang w:bidi="fa-IR"/>
               </w:rPr>
-              <w:t xml:space="preserve"> علی محمدی</w:t>
+              <w:t xml:space="preserve"> نرگس حسینی‌پور</w:t>
             </w:r>
             <w:r>
               <w:rPr>
@@ -613,7 +613,7 @@
                 <w:rtl/>
                 <w:lang w:bidi="fa-IR"/>
               </w:rPr>
-              <w:t>۸۱۰۱۰۳۳۰۷</w:t>
+              <w:t>۸۱۰۱۰۰۱۲۶</w:t>
             </w:r>
             <w:r>
               <w:rPr>

</xml_diff>